<commit_message>
Neutral memo style for colleagues: plain headings, no direct address
Findings-first structure, dry section titles, impersonal business
Russian throughout; removed reader-addressed phrasing and editorial
asides. Content and verified numbers unchanged.

Co-Authored-By: Claude Fable 5 <noreply@anthropic.com>
Claude-Session: https://claude.ai/code/session_01VmLeB8hbTzboYUEuRn3WU6
</commit_message>
<xml_diff>
--- a/rental-analysis/Сравнение_расчетов_аренды_Amsterdamsestraatweg_268.docx
+++ b/rental-analysis/Сравнение_расчетов_аренды_Amsterdamsestraatweg_268.docx
@@ -12,10 +12,24 @@
           <w:b/>
           <w:bCs/>
           <w:color w:val="1F2A38"/>
-          <w:sz w:val="40"/>
-          <w:szCs w:val="40"/>
+          <w:sz w:val="38"/>
+          <w:szCs w:val="38"/>
         </w:rPr>
-        <w:t xml:space="preserve">Максимальная аренда: сертификат против WOZ</w:t>
+        <w:t xml:space="preserve">Анализ максимальной арендной платы</w:t>
+      </w:r>
+    </w:p>
+    <w:p>
+      <w:pPr>
+        <w:spacing w:after="60"/>
+      </w:pPr>
+      <w:r>
+        <w:rPr>
+          <w:rFonts w:ascii="Cambria" w:cs="Cambria" w:eastAsia="Cambria" w:hAnsi="Cambria"/>
+          <w:color w:val="31537D"/>
+          <w:sz w:val="24"/>
+          <w:szCs w:val="24"/>
+        </w:rPr>
+        <w:t xml:space="preserve">Amsterdamsestraatweg 268, 3551 CS Utrecht — сравнение расчётов Huurprijscheck</w:t>
       </w:r>
     </w:p>
     <w:p>
@@ -31,35 +45,7 @@
           <w:sz w:val="20"/>
           <w:szCs w:val="20"/>
         </w:rPr>
-        <w:t xml:space="preserve">Amsterdamsestraatweg 268, Utrecht · сравнение трёх расчётов Huurprijscheck от 27.08.2026 · сверено с политикой Huurcommissie</w:t>
-      </w:r>
-    </w:p>
-    <w:p>
-      <w:pPr>
-        <w:spacing w:after="160" w:line="300"/>
-      </w:pPr>
-      <w:r>
-        <w:t xml:space="preserve">Этот документ сводит вместе три расчёта, сделанные 27 августа 2026 года в онлайн-проверке Huurcommissie, и отвечает на вопрос, какой из двух пока неизвестных параметров — энергетический сертификат или кадастровая стоимость WOZ — сильнее влияет на допустимую аренду. Короткий ответ: сертификат, с большим отрывом. Шаг с класса C на класс B прибавляет </w:t>
-      </w:r>
-      <w:r>
-        <w:rPr>
-          <w:b/>
-          <w:bCs/>
-        </w:rPr>
-        <w:t xml:space="preserve">82,32 евро в месяц</w:t>
-      </w:r>
-      <w:r>
-        <w:t xml:space="preserve">, тогда как рост WOZ на двадцать тысяч — только </w:t>
-      </w:r>
-      <w:r>
-        <w:rPr>
-          <w:b/>
-          <w:bCs/>
-        </w:rPr>
-        <w:t xml:space="preserve">20,55 евро</w:t>
-      </w:r>
-      <w:r>
-        <w:t xml:space="preserve">. Все правила и формулы дополнительно сверены с действующей политикой самой Huurcommissie (beleidsboek «Waarderingsstelsel zelfstandige woonruimte», редакция января 2026 года); расхождений не нашлось. Как именно проверялось — ниже, в отдельном разделе.</w:t>
+        <w:t xml:space="preserve">Расчёты: 27.08.2026, тарифы 2026 года · Правила начисления сверены с beleidsboek Huurcommissie (редакция января 2026 года)</w:t>
       </w:r>
     </w:p>
     <w:p>
@@ -73,10 +59,112 @@
           <w:b/>
           <w:bCs/>
           <w:color w:val="1F2A38"/>
-          <w:sz w:val="28"/>
-          <w:szCs w:val="28"/>
+          <w:sz w:val="27"/>
+          <w:szCs w:val="27"/>
         </w:rPr>
-        <w:t xml:space="preserve">Как устроен расчёт и что в нём постоянно</w:t>
+        <w:t xml:space="preserve">Основные выводы</w:t>
+      </w:r>
+    </w:p>
+    <w:p>
+      <w:pPr>
+        <w:pStyle w:val="ListParagraph"/>
+        <w:numPr>
+          <w:ilvl w:val="0"/>
+          <w:numId w:val="2"/>
+        </w:numPr>
+        <w:spacing w:after="120" w:line="300"/>
+      </w:pPr>
+      <w:r>
+        <w:t xml:space="preserve">Энергосертификат влияет на максимальную аренду существенно сильнее, чем WOZ-стоимость. Переход с класса C на класс B добавляет 12 баллов и </w:t>
+      </w:r>
+      <w:r>
+        <w:rPr>
+          <w:b/>
+          <w:bCs/>
+        </w:rPr>
+        <w:t xml:space="preserve">€ 82,32 в месяц (+9,9 %)</w:t>
+      </w:r>
+      <w:r>
+        <w:t xml:space="preserve">; рост WOZ с € 210 000 до € 230 000 — 3 балла и </w:t>
+      </w:r>
+      <w:r>
+        <w:rPr>
+          <w:b/>
+          <w:bCs/>
+        </w:rPr>
+        <w:t xml:space="preserve">€ 20,55 (+2,5 %)</w:t>
+      </w:r>
+      <w:r>
+        <w:t xml:space="preserve">. Для компенсации одного шага сертификата WOZ должна была бы вырасти примерно на € 80 000.</w:t>
+      </w:r>
+    </w:p>
+    <w:p>
+      <w:pPr>
+        <w:pStyle w:val="ListParagraph"/>
+        <w:numPr>
+          <w:ilvl w:val="0"/>
+          <w:numId w:val="2"/>
+        </w:numPr>
+        <w:spacing w:after="120" w:line="300"/>
+      </w:pPr>
+      <w:r>
+        <w:t xml:space="preserve">Во всех рассмотренных сценариях объект остаётся в социальном (регулируемом) сегменте: 128–140 баллов при границе сегмента 143 балла. Максимальная аренда — от € 829,94 до € 912,26 в месяц.</w:t>
+      </w:r>
+    </w:p>
+    <w:p>
+      <w:pPr>
+        <w:pStyle w:val="ListParagraph"/>
+        <w:numPr>
+          <w:ilvl w:val="0"/>
+          <w:numId w:val="2"/>
+        </w:numPr>
+        <w:spacing w:after="120" w:line="300"/>
+      </w:pPr>
+      <w:r>
+        <w:t xml:space="preserve">Расчёты арифметически корректны. Правила начисления сверены с политикой Huurcommissie; расхождений не выявлено (раздел «Проверка расчётов»).</w:t>
+      </w:r>
+    </w:p>
+    <w:p>
+      <w:pPr>
+        <w:pStyle w:val="ListParagraph"/>
+        <w:numPr>
+          <w:ilvl w:val="0"/>
+          <w:numId w:val="2"/>
+        </w:numPr>
+        <w:spacing w:after="120" w:line="300"/>
+      </w:pPr>
+      <w:r>
+        <w:t xml:space="preserve">До получения WOZ-оценки (2027 год) при официальной проверке применяется 85 % стоимости из отчёта сертифицированного оценщика, а при отсутствии отчёта — минимальная WOZ € 77 582, что означало бы снижение потолка примерно на € 140 в месяц. Отчёт целесообразно подготовить до сдачи объекта.</w:t>
+      </w:r>
+    </w:p>
+    <w:p>
+      <w:pPr>
+        <w:pStyle w:val="ListParagraph"/>
+        <w:numPr>
+          <w:ilvl w:val="0"/>
+          <w:numId w:val="2"/>
+        </w:numPr>
+        <w:spacing w:after="120" w:line="300"/>
+      </w:pPr>
+      <w:r>
+        <w:t xml:space="preserve">Наибольший потенциал повышения дают улучшение сертификата и оформление чердака. Реалистичный максимум — около € 974–1 022 в месяц (раздел «Меры по увеличению максимальной аренды»).</w:t>
+      </w:r>
+    </w:p>
+    <w:p>
+      <w:pPr>
+        <w:pStyle w:val="Heading1"/>
+        <w:spacing w:after="180" w:before="380"/>
+      </w:pPr>
+      <w:r>
+        <w:rPr>
+          <w:rFonts w:ascii="Cambria" w:cs="Cambria" w:eastAsia="Cambria" w:hAnsi="Cambria"/>
+          <w:b/>
+          <w:bCs/>
+          <w:color w:val="1F2A38"/>
+          <w:sz w:val="27"/>
+          <w:szCs w:val="27"/>
+        </w:rPr>
+        <w:t xml:space="preserve">Исходные данные</w:t>
       </w:r>
     </w:p>
     <w:p>
@@ -84,7 +172,7 @@
         <w:spacing w:after="160" w:line="300"/>
       </w:pPr>
       <w:r>
-        <w:t xml:space="preserve">Аренда большинства нидерландских квартир ограничена балльной системой WWS. Квартира набирает баллы за площадь, кухню, санузел, террасу, энергоэффективность и WOZ-стоимость; сумма баллов по государственной таблице превращается в потолок месячной аренды. В таблице 2026 года для этой квартиры один балл стоит около 6,86 евро в месяц. До 143 баллов жильё относится к социальному сегменту, со 144 до 186 — к среднему (middenhuur, тоже с потолком), от 187 начинается свободный рынок. Все три ваших сценария — социальный сегмент.</w:t>
+        <w:t xml:space="preserve">Максимальная аренда определяется государственной балльной системой WWS: баллы начисляются за площадь, оснащение, энергоэффективность и WOZ-стоимость, после чего сумма по официальной таблице переводится в предельную месячную аренду. В таблице 2026 года один балл соответствует примерно € 6,86 в месяц. До 143 баллов жильё относится к социальному сегменту, со 144 до 186 — к среднему (middenhuur, также с потолком), от 187 баллов регулирование не применяется.</w:t>
       </w:r>
     </w:p>
     <w:p>
@@ -92,7 +180,7 @@
         <w:spacing w:after="160" w:line="300"/>
       </w:pPr>
       <w:r>
-        <w:t xml:space="preserve">В расчётах менялись только сертификат и WOZ. Всё остальное неизменно и в сумме даёт </w:t>
+        <w:t xml:space="preserve">Объект — самостоятельное жильё типа eengezinswoning: гостиная с открытой кухней (20,4 м²), спальня (9,3 м²), ванная (2,7 м²), чердачная кладовая без стационарной лестницы (13 м²), терраса на крыше (9,6 м²). Выполнены три расчёта в онлайн-инструменте Huurprijscheck; между ними менялись только класс сертификата (B/C) и WOZ-стоимость (€ 210 000 / € 230 000). Остальные характеристики неизменны, их суммарная оценка — </w:t>
       </w:r>
       <w:r>
         <w:rPr>
@@ -102,7 +190,7 @@
         <w:t xml:space="preserve">72,75 балла</w:t>
       </w:r>
       <w:r>
-        <w:t xml:space="preserve"> — эту величину удобно держать в голове: итог любого сценария равен 72,75 плюс баллы за WOZ и сертификат, с округлением до целого (половина и выше — вверх).</w:t>
+        <w:t xml:space="preserve">. Итог каждого сценария равен 72,75 плюс баллы за WOZ и сертификат, с округлением до целого (0,5 и выше — вверх).</w:t>
       </w:r>
     </w:p>
     <w:tbl>
@@ -192,7 +280,7 @@
                 <w:sz w:val="20"/>
                 <w:szCs w:val="20"/>
               </w:rPr>
-              <w:t xml:space="preserve">Как считается</w:t>
+              <w:t xml:space="preserve">Расчёт</w:t>
             </w:r>
           </w:p>
         </w:tc>
@@ -367,7 +455,7 @@
                 <w:sz w:val="21"/>
                 <w:szCs w:val="21"/>
               </w:rPr>
-              <w:t xml:space="preserve">Чердачная кладовая 13 м² — без стационарной лестницы</w:t>
+              <w:t xml:space="preserve">Чердачная кладовая 13 м² без стационарной лестницы</w:t>
             </w:r>
           </w:p>
         </w:tc>
@@ -471,7 +559,7 @@
                 <w:sz w:val="21"/>
                 <w:szCs w:val="21"/>
               </w:rPr>
-              <w:t xml:space="preserve">Отопление: открытая кухня считается отдельной комнатой</w:t>
+              <w:t xml:space="preserve">Отопление (отапливаемая открытая кухня считается отдельной комнатой)</w:t>
             </w:r>
           </w:p>
         </w:tc>
@@ -505,7 +593,7 @@
                 <w:sz w:val="21"/>
                 <w:szCs w:val="21"/>
               </w:rPr>
-              <w:t xml:space="preserve">2 × 4 комнаты</w:t>
+              <w:t xml:space="preserve">4 комнаты × 2</w:t>
             </w:r>
           </w:p>
         </w:tc>
@@ -972,10 +1060,10 @@
           <w:b/>
           <w:bCs/>
           <w:color w:val="1F2A38"/>
-          <w:sz w:val="28"/>
-          <w:szCs w:val="28"/>
+          <w:sz w:val="27"/>
+          <w:szCs w:val="27"/>
         </w:rPr>
-        <w:t xml:space="preserve">Три расчёта рядом</w:t>
+        <w:t xml:space="preserve">Результаты расчётов</w:t>
       </w:r>
     </w:p>
     <w:tbl>
@@ -2000,7 +2088,7 @@
                 <w:sz w:val="21"/>
                 <w:szCs w:val="21"/>
               </w:rPr>
-              <w:t xml:space="preserve">Потолок аренды, в месяц</w:t>
+              <w:t xml:space="preserve">Максимальная аренда, в месяц</w:t>
             </w:r>
           </w:p>
         </w:tc>
@@ -2138,7 +2226,7 @@
                 <w:sz w:val="21"/>
                 <w:szCs w:val="21"/>
               </w:rPr>
-              <w:t xml:space="preserve">За год</w:t>
+              <w:t xml:space="preserve">В год</w:t>
             </w:r>
           </w:p>
         </w:tc>
@@ -2251,7 +2339,7 @@
         <w:spacing w:after="160" w:before="160"/>
       </w:pPr>
       <w:r>
-        <w:t xml:space="preserve">Разница между первым и вторым расчётом — это в чистом виде цена сертификата: двенадцать баллов и 82,32 евро в месяц, почти тысяча в год. Разница между вторым и третьим — цена двадцати тысяч WOZ: три балла и 20,55 евро. На один балл в обоих случаях приходится по 6,85–6,86 евро, так что соотношение честное: сертификат здесь ровно вчетверо весомее.</w:t>
+        <w:t xml:space="preserve">Разница между расчётами 1 и 2 отражает эффект сертификата: 12 баллов и € 82,32 в месяц, около € 990 в год. Разница между расчётами 2 и 3 — эффект увеличения WOZ на € 20 000: 3 балла и € 20,55 в месяц. Стоимость одного балла в обоих случаях составляет € 6,85–6,86, то есть по деньгам эффект сертификата ровно вчетверо больше.</w:t>
       </w:r>
     </w:p>
     <w:p>
@@ -2265,10 +2353,10 @@
           <w:b/>
           <w:bCs/>
           <w:color w:val="1F2A38"/>
-          <w:sz w:val="28"/>
-          <w:szCs w:val="28"/>
+          <w:sz w:val="27"/>
+          <w:szCs w:val="27"/>
         </w:rPr>
-        <w:t xml:space="preserve">Проверка: откуда цифры и почему им можно верить</w:t>
+        <w:t xml:space="preserve">Проверка расчётов</w:t>
       </w:r>
     </w:p>
     <w:p>
@@ -2276,7 +2364,7 @@
         <w:spacing w:after="160" w:line="300"/>
       </w:pPr>
       <w:r>
-        <w:t xml:space="preserve">По вашей просьбе расчёты перепроверены дважды: сначала арифметически, затем по первоисточнику — политике Huurcommissie (beleidsboek), где прописаны все правила начисления баллов. Это тот же документ, которым руководствуются инспекторы комиссии при официальной оценке.</w:t>
+        <w:t xml:space="preserve">Проверка выполнена в два этапа: пересчёт всех позиций по правилам WWS и сверка самих правил с политикой Huurcommissie — beleidsboek «Waarderingsstelsel zelfstandige woonruimte» (действующая редакция от января 2026 года). Этим же документом руководствуются инспекторы комиссии при официальной оценке.</w:t>
       </w:r>
     </w:p>
     <w:p>
@@ -2284,7 +2372,7 @@
         <w:spacing w:after="160" w:line="300"/>
       </w:pPr>
       <w:r>
-        <w:t xml:space="preserve">Арифметика. Площадь комнат 32,34 м² округляется до 32 и даёт 32 балла, по баллу за метр. Кладовая: 13 × 0,75 = 9,75, минус 5 за отсутствие стационарной лестницы — 4,75; вычет прописан в политике дословно. Отопление: по два балла за каждую отапливаемую комнату, причём отапливаемая открытая кухня считается отдельной комнатой — отсюда 4 + 2 + 2 = 8. Кухня: 7 баллов за столешницу длиннее двух метров плюс 5,5 за технику (лимит для техники — не больше баллов самой столешницы, то есть до 7). Санузел: душ 4, туалет 2, раковина 1, ещё 3 за оснащение. Терраса: 2 + 0,35 × 10 = 5,5 — в политике приведён пример ровно с десятью метрами и тем же результатом. Вместе 72,75.</w:t>
+        <w:t xml:space="preserve">Постоянная часть. Площадь комнат 32,34 м² округляется до 32 м² и даёт 32 балла, по баллу за метр. Кладовая: 13 × 0,75 = 9,75 минус 5 за отсутствие стационарной лестницы — 4,75; вычет прописан в политике дословно. Отопление: по два балла за каждую отапливаемую комнату, при этом отапливаемая открытая кухня учитывается как отдельная комната, отсюда 4 + 2 + 2 = 8. Кухня: 7 баллов за столешницу длиннее двух метров плюс 5,5 за технику (лимит для техники равен баллам столешницы, то есть 7). Санузел: душ 4, туалет 2, раковина 1, ещё 3 за оснащение при лимите, равном баллам душа и ванны. Терраса: 2 + 0,35 × 10 = 5,5; в политике приведён пример с теми же десятью метрами и тем же результатом. Сумма — 72,75.</w:t>
       </w:r>
     </w:p>
     <w:p>
@@ -2292,7 +2380,7 @@
         <w:spacing w:after="160" w:line="300"/>
       </w:pPr>
       <w:r>
-        <w:t xml:space="preserve">Сертификат. Таблица для домов типа eengezinswoning даёт B — 34 балла, C — 22; в расчётах стоят именно эти значения.</w:t>
+        <w:t xml:space="preserve">Сертификат. Таблица для домов типа eengezinswoning: класс B — 34 балла, класс C — 22. В расчётах указаны эти же значения.</w:t>
       </w:r>
     </w:p>
     <w:p>
@@ -2300,7 +2388,7 @@
         <w:spacing w:after="160" w:line="300"/>
       </w:pPr>
       <w:r>
-        <w:t xml:space="preserve">WOZ. Баллы считаются по официальной формуле из двух частей: стоимость делится на 15 329 евро, и отдельно стоимость на квадратный метр (у вас 45 м² комнат и кладовой) делится на 242 евро. Для 210 тысяч выходит 13,70 + 19,28 = 32,98, после округления 33; для 230 тысяч — 36,12, округлённо 36. Совпадение с расчётами точное.</w:t>
+        <w:t xml:space="preserve">WOZ. Баллы определяются по официальной формуле из двух частей: стоимость делится на € 15 329, и отдельно стоимость на квадратный метр (при 45 м² комнат и кладовой) делится на € 242. Для € 210 000: 13,70 + 19,28 = 32,98, после округления 33. Для € 230 000: 36,12, округлённо 36. Значения совпадают с расчётами точно.</w:t>
       </w:r>
     </w:p>
     <w:p>
@@ -2308,7 +2396,7 @@
         <w:spacing w:after="160" w:line="300"/>
       </w:pPr>
       <w:r>
-        <w:t xml:space="preserve">Суммы аренды. Три официальных результата лежат на одной прямой — 6,86 евро за балл минус 48 евро — с отклонением в три цента. Это значит, что сайт считал все варианты по одной и той же таблице 2026 года, а заодно даёт нам способ оценивать промежуточные сценарии.</w:t>
+        <w:t xml:space="preserve">Суммы аренды. Три результата лежат на одной прямой € 6,86 × баллы − € 48,14 с отклонением не более трёх центов. Это подтверждает, что все варианты посчитаны по единой таблице 2026 года, и позволяет корректно оценивать промежуточные сценарии.</w:t>
       </w:r>
     </w:p>
     <w:p>
@@ -2322,10 +2410,10 @@
           <w:b/>
           <w:bCs/>
           <w:color w:val="1F2A38"/>
-          <w:sz w:val="28"/>
-          <w:szCs w:val="28"/>
+          <w:sz w:val="27"/>
+          <w:szCs w:val="27"/>
         </w:rPr>
-        <w:t xml:space="preserve">Почему сертификат перевешивает</w:t>
+        <w:t xml:space="preserve">Влияние сертификата и WOZ-стоимости</w:t>
       </w:r>
     </w:p>
     <w:p>
@@ -2333,7 +2421,7 @@
         <w:spacing w:after="160" w:line="300"/>
       </w:pPr>
       <w:r>
-        <w:t xml:space="preserve">Дело в крутизне шкалы. Один шаг сертификата, с C на B, стоит сразу двенадцать баллов; WOZ приносит примерно балл за каждые 6 700 евро стоимости. Чтобы догнать один шаг сертификата, оценка должна была бы вырасти на 80 тысяч — от муниципальной переоценки такого ждать не приходится. Есть и второй эффект: делители в формуле WOZ ежегодно индексируются вместе со средним ростом цен по стране, поэтому обычный рыночный рост стоимости сам по себе баллов почти не добавляет. Заметно влияет лишь то, насколько ваша квартира отклонится от среднего.</w:t>
+        <w:t xml:space="preserve">Шкала сертификатов дискретна: один шаг с C на B добавляет сразу 12 баллов. WOZ конвертируется в баллы постепенно, примерно по баллу на каждые € 6 700 стоимости, поэтому для эффекта, равного одному шагу сертификата, потребовался бы рост оценки на € 80 000 — далеко за пределами реалистичного разброса. Дополнительно следует учитывать, что делители формулы WOZ ежегодно индексируются вместе со средним ростом цен по стране: общий рыночный рост стоимости баллов практически не добавляет, значимо лишь отклонение конкретного объекта от среднего.</w:t>
       </w:r>
     </w:p>
     <w:p>
@@ -2341,7 +2429,7 @@
         <w:spacing w:after="160" w:line="300"/>
       </w:pPr>
       <w:r>
-        <w:t xml:space="preserve">Для планирования это означает простую вещь: по WOZ можно спокойно считать по нижней границе, 210 тысяч, — ошибка не превысит двадцати евро в месяц. Настоящая развилка — сертификат: между B и C лежит почти тысяча евро в год, и именно эту неопределённость стоит снимать первой, заказав официальное энергообследование.</w:t>
+        <w:t xml:space="preserve">Для планирования достаточно консервативного значения € 210 000 — ошибка не превысит € 20 в месяц. Основная неопределённость сосредоточена в классе сертификата (порядка € 1 000 в год между B и C); её целесообразно снимать в первую очередь, заказав официальное энергообследование.</w:t>
       </w:r>
     </w:p>
     <w:p>
@@ -2355,10 +2443,10 @@
           <w:b/>
           <w:bCs/>
           <w:color w:val="31537D"/>
-          <w:sz w:val="24"/>
-          <w:szCs w:val="24"/>
+          <w:sz w:val="23"/>
+          <w:szCs w:val="23"/>
         </w:rPr>
-        <w:t xml:space="preserve">Шкала сертификатов для домов этого типа</w:t>
+        <w:t xml:space="preserve">Шкала сертификатов (eengezinswoning)</w:t>
       </w:r>
     </w:p>
     <w:tbl>
@@ -3143,7 +3231,7 @@
                 <w:sz w:val="21"/>
                 <w:szCs w:val="21"/>
               </w:rPr>
-              <w:t xml:space="preserve">Сертификата нет, дом 1976 года или старше</w:t>
+              <w:t xml:space="preserve">Без сертификата, дом 1976 года или старше</w:t>
             </w:r>
           </w:p>
         </w:tc>
@@ -3229,7 +3317,7 @@
           <w:sz w:val="19"/>
           <w:szCs w:val="19"/>
         </w:rPr>
-        <w:t xml:space="preserve">Без действующего зарегистрированного сертификата баллы назначаются по году постройки: 2002 и позже — 41, 2000–2001 — 34, 1992–1999 — 22, 1984–1991 — 14, 1979–1983 — −4, 1977–1978 — −9, 1976 и старше — −15.</w:t>
+        <w:t xml:space="preserve">При отсутствии действующего зарегистрированного сертификата баллы назначаются по году постройки: 2002 и позже — 41, 2000–2001 — 34, 1992–1999 — 22, 1984–1991 — 14, 1979–1983 — −4, 1977–1978 — −9, 1976 и старше — −15.</w:t>
       </w:r>
     </w:p>
     <w:p>
@@ -3243,10 +3331,10 @@
           <w:b/>
           <w:bCs/>
           <w:color w:val="1F2A38"/>
-          <w:sz w:val="28"/>
-          <w:szCs w:val="28"/>
+          <w:sz w:val="27"/>
+          <w:szCs w:val="27"/>
         </w:rPr>
-        <w:t xml:space="preserve">Сценарии, включая промежуточные</w:t>
+        <w:t xml:space="preserve">Дополнительные сценарии</w:t>
       </w:r>
     </w:p>
     <w:p>
@@ -3254,7 +3342,7 @@
         <w:spacing w:after="160" w:line="300"/>
       </w:pPr>
       <w:r>
-        <w:t xml:space="preserve">Три строки, отмеченные как расчёт, — официальные результаты Huurprijscheck. Остальные получены по той же схеме: баллы точные, аренда оценена по 6,86 евро за балл и помечена знаком ≈.</w:t>
+        <w:t xml:space="preserve">Строки с пометкой «расчёт» — официальные результаты Huurprijscheck. Остальные получены по той же схеме: баллы точные, аренда оценена по € 6,86 за балл и помечена знаком ≈.</w:t>
       </w:r>
     </w:p>
     <w:tbl>
@@ -3487,7 +3575,7 @@
                 <w:sz w:val="21"/>
                 <w:szCs w:val="21"/>
               </w:rPr>
-              <w:t xml:space="preserve">Нет сертификата</w:t>
+              <w:t xml:space="preserve">Без сертификата</w:t>
             </w:r>
           </w:p>
         </w:tc>
@@ -4846,7 +4934,7 @@
         <w:spacing w:before="160"/>
       </w:pPr>
       <w:r>
-        <w:t xml:space="preserve">Переход через границу 143 баллов ничего резкого не делает: потолок продолжает расти по той же таблице, меняются лишь отдельные правила вроде порядка ежегодной индексации. Настоящий скачок был бы на отметке 187 баллов, где регулирование заканчивается, но для этой квартиры она недостижима — даже лучшая комбинация даёт около 156.</w:t>
+        <w:t xml:space="preserve">Пересечение границы 143 баллов не создаёт скачка: потолок продолжает расти по той же таблице, меняются отдельные правила, в частности порядок ежегодной индексации. Регулирование заканчивается на 187 баллах; для данного объекта эта отметка недостижима — максимальная комбинация даёт около 156.</w:t>
       </w:r>
     </w:p>
     <w:p>
@@ -4860,10 +4948,10 @@
           <w:b/>
           <w:bCs/>
           <w:color w:val="1F2A38"/>
-          <w:sz w:val="28"/>
-          <w:szCs w:val="28"/>
+          <w:sz w:val="27"/>
+          <w:szCs w:val="27"/>
         </w:rPr>
-        <w:t xml:space="preserve">Как поднять потолок: сначала защита, потом рост</w:t>
+        <w:t xml:space="preserve">Меры по увеличению максимальной аренды</w:t>
       </w:r>
     </w:p>
     <w:p>
@@ -4871,7 +4959,7 @@
         <w:spacing w:after="160" w:line="300"/>
       </w:pPr>
       <w:r>
-        <w:t xml:space="preserve">Прежде чем говорить о повышении, два защитных шага. Без них можно потерять больше, чем дают все улучшения вместе.</w:t>
+        <w:t xml:space="preserve">Сначала два обязательных условия: их невыполнение снижает потолок сильнее, чем любые улучшения его поднимают.</w:t>
       </w:r>
     </w:p>
     <w:p>
@@ -4885,10 +4973,10 @@
           <w:b/>
           <w:bCs/>
           <w:color w:val="31537D"/>
-          <w:sz w:val="24"/>
-          <w:szCs w:val="24"/>
+          <w:sz w:val="23"/>
+          <w:szCs w:val="23"/>
         </w:rPr>
-        <w:t xml:space="preserve">Зарегистрировать сертификат</w:t>
+        <w:t xml:space="preserve">Регистрация сертификата</w:t>
       </w:r>
     </w:p>
     <w:p>
@@ -4896,7 +4984,7 @@
         <w:spacing w:after="160" w:line="300"/>
       </w:pPr>
       <w:r>
-        <w:t xml:space="preserve">Учитывается только действующий сертификат из официального реестра. Если его нет, баллы назначаются по году постройки, и для дома 1976 года или старше это минус 15 — как у худшего класса G. Потолок в таком сценарии опускается примерно до 580 евро. Иначе говоря, сама регистрация сертификата удерживает порядка 250 евро в месяц.</w:t>
+        <w:t xml:space="preserve">Учитывается только действующий сертификат в официальном реестре. При его отсутствии баллы назначаются по году постройки; для дома 1976 года или старше это −15 баллов, уровень класса G, и потолок около € 580 в месяц. Разница с зарегистрированным сертификатом C составляет порядка € 250 в месяц.</w:t>
       </w:r>
     </w:p>
     <w:p>
@@ -4910,10 +4998,10 @@
           <w:b/>
           <w:bCs/>
           <w:color w:val="31537D"/>
-          <w:sz w:val="24"/>
-          <w:szCs w:val="24"/>
+          <w:sz w:val="23"/>
+          <w:szCs w:val="23"/>
         </w:rPr>
-        <w:t xml:space="preserve">Подготовить оценочный отчёт на время, пока WOZ нет</w:t>
+        <w:t xml:space="preserve">Оценочный отчёт до появления WOZ</w:t>
       </w:r>
     </w:p>
     <w:p>
@@ -4921,7 +5009,7 @@
         <w:spacing w:after="160" w:line="300"/>
       </w:pPr>
       <w:r>
-        <w:t xml:space="preserve">До 2027 года официальной WOZ-оценки не существует, а правило на этот случай жёсткое. Комиссия принимает либо 85 процентов стоимости из отчёта сертифицированного оценщика (Register-Taxateur) — отчёт обязан предоставить арендодатель, — либо, если отчёта нет, минимальную WOZ, установленную в 77 582 евро. Минимальная WOZ дала бы вместо 33 баллов лишь около 12, то есть минус 140 с лишним евро к потолку. Сравнение с похожими квартирами, которое практиковалось раньше, с 2024 года прямо запрещено. Если квартира будет сдана до получения WOZ-оценки, отчёт оценщика должен быть готов заранее.</w:t>
+        <w:t xml:space="preserve">До 2027 года официальной WOZ-оценки не существует. На этот случай комиссия принимает 85 % стоимости из отчёта сертифицированного оценщика (Register-Taxateur); предоставить отчёт обязан арендодатель. При отсутствии отчёта применяется минимальная WOZ € 77 582 — это около 12 баллов вместо 33 и снижение потолка более чем на € 140 в месяц. Сопоставление с аналогичными квартирами с 2024 года не допускается. Если объект сдаётся до получения WOZ-оценки, отчёт должен быть подготовлен заранее.</w:t>
       </w:r>
     </w:p>
     <w:p>
@@ -4935,8 +5023,8 @@
           <w:b/>
           <w:bCs/>
           <w:color w:val="31537D"/>
-          <w:sz w:val="24"/>
-          <w:szCs w:val="24"/>
+          <w:sz w:val="23"/>
+          <w:szCs w:val="23"/>
         </w:rPr>
         <w:t xml:space="preserve">Меры повышения, по убыванию эффекта</w:t>
       </w:r>
@@ -5238,7 +5326,7 @@
                 <w:sz w:val="19"/>
                 <w:szCs w:val="19"/>
               </w:rPr>
-              <w:t xml:space="preserve">Самый выгодный шаг; состав работ покажет энергообследование — обычно утепление, стеклопакеты, система отопления.</w:t>
+              <w:t xml:space="preserve">Состав работ определяется энергообследованием; как правило, утепление, остекление, система отопления.</w:t>
             </w:r>
           </w:p>
         </w:tc>
@@ -5377,7 +5465,7 @@
                 <w:sz w:val="19"/>
                 <w:szCs w:val="19"/>
               </w:rPr>
-              <w:t xml:space="preserve">Итого от C до A — 19 баллов и около 130 евро. Классы выше A добавляют ещё, но для старого дома это редкость.</w:t>
+              <w:t xml:space="preserve">Суммарно от C до A — 19 баллов и около € 130. Классы выше A для дома старой постройки труднодостижимы.</w:t>
             </w:r>
           </w:p>
         </w:tc>
@@ -5413,7 +5501,7 @@
                 <w:sz w:val="21"/>
                 <w:szCs w:val="21"/>
               </w:rPr>
-              <w:t xml:space="preserve">Чердак сделать жилой комнатой</w:t>
+              <w:t xml:space="preserve">Переоборудование чердака в жилую комнату</w:t>
             </w:r>
           </w:p>
         </w:tc>
@@ -5516,7 +5604,7 @@
                 <w:sz w:val="19"/>
                 <w:szCs w:val="19"/>
               </w:rPr>
-              <w:t xml:space="preserve">Требования из политики: стационарная лестница, обшитая кровля, окно от 0,5 м², вентиляция, розетка и свет, высота 2,10 м минимум над половиной площади. С отоплением комнаты — ещё 2 балла (всего +10,25, около +€ 70).</w:t>
+              <w:t xml:space="preserve">Требования: стационарная лестница, обшитая кровля, окно от 0,5 м², вентиляция, розетка и освещение, высота 2,10 м минимум над половиной площади. При отоплении комнаты — ещё 2 балла (итого +10,25, около +€ 70).</w:t>
             </w:r>
           </w:p>
         </w:tc>
@@ -5552,7 +5640,7 @@
                 <w:sz w:val="21"/>
                 <w:szCs w:val="21"/>
               </w:rPr>
-              <w:t xml:space="preserve">Либо только стационарная лестница на чердак</w:t>
+              <w:t xml:space="preserve">Стационарная лестница на чердак без переоборудования</w:t>
             </w:r>
           </w:p>
         </w:tc>
@@ -5655,7 +5743,7 @@
                 <w:sz w:val="19"/>
                 <w:szCs w:val="19"/>
               </w:rPr>
-              <w:t xml:space="preserve">Снимает вычет за приставную лестницу; самый дешёвый строительный вариант. С предыдущей мерой не суммируется.</w:t>
+              <w:t xml:space="preserve">Снимает вычет за приставную лестницу. С предыдущей мерой не суммируется.</w:t>
             </w:r>
           </w:p>
         </w:tc>
@@ -5691,7 +5779,7 @@
                 <w:sz w:val="21"/>
                 <w:szCs w:val="21"/>
               </w:rPr>
-              <w:t xml:space="preserve">Проверить статус памятника</w:t>
+              <w:t xml:space="preserve">Проверка статуса памятника</w:t>
             </w:r>
           </w:p>
         </w:tc>
@@ -5794,7 +5882,7 @@
                 <w:sz w:val="19"/>
                 <w:szCs w:val="19"/>
               </w:rPr>
-              <w:t xml:space="preserve">Надбавка к потолку: национальный памятник +35 %, муниципальный или провинциальный +15 %, охраняемый городской ансамбль при постройке до 1965 года +5 %. Надбавки между собой не сочетаются; статус доказывает арендодатель. У памятников к тому же не бывает штрафных баллов за классы E–G.</w:t>
+              <w:t xml:space="preserve">Надбавка к потолку: национальный памятник +35 %, муниципальный или провинциальный +15 %, охраняемый городской ансамбль при постройке до 1965 года +5 %. Надбавки между собой не сочетаются; статус подтверждает арендодатель. Для памятников штрафные баллы за классы E–G не применяются.</w:t>
             </w:r>
           </w:p>
         </w:tc>
@@ -5830,7 +5918,7 @@
                 <w:sz w:val="21"/>
                 <w:szCs w:val="21"/>
               </w:rPr>
-              <w:t xml:space="preserve">Проверить WOZ-оценку 2027 года</w:t>
+              <w:t xml:space="preserve">Контроль WOZ-оценки 2027 года</w:t>
             </w:r>
           </w:p>
         </w:tc>
@@ -5933,7 +6021,7 @@
                 <w:sz w:val="19"/>
                 <w:szCs w:val="19"/>
               </w:rPr>
-              <w:t xml:space="preserve">Возражение против оценки можно подавать и в сторону повышения — арендодателю выгодна высокая WOZ.</w:t>
+              <w:t xml:space="preserve">Возражение (bezwaar) возможно и в сторону повышения: высокая WOZ увеличивает потолок.</w:t>
             </w:r>
           </w:p>
         </w:tc>
@@ -6072,7 +6160,7 @@
                 <w:sz w:val="19"/>
                 <w:szCs w:val="19"/>
               </w:rPr>
-              <w:t xml:space="preserve">Добирает лимит баллов за кухонную технику до максимума. Из-за округления итога прибавка может оказаться чуть меньше.</w:t>
+              <w:t xml:space="preserve">Доводит баллы за кухонную технику до лимита. С учётом округления итога прибавка может быть меньше.</w:t>
             </w:r>
           </w:p>
         </w:tc>
@@ -6083,7 +6171,7 @@
         <w:spacing w:before="160"/>
       </w:pPr>
       <w:r>
-        <w:t xml:space="preserve">Мелкие улучшения санузла приносят доли балла, а ванна или второй туалет в помещении 2,66 м² не поместятся, так что этим направлением можно пренебречь.</w:t>
+        <w:t xml:space="preserve">Мелкие улучшения санузла дают доли балла, их вклад несуществен; установка ванны или второго туалета в помещении 2,66 м² невозможна. Комбинация мер: сертификат B, стационарная лестница и посудомоечная машина при WOZ € 230 000 дают 149 баллов и около € 974 в месяц; с сертификатом A — около 156 баллов и € 1 022, не считая возможной надбавки за статус памятника.</w:t>
       </w:r>
     </w:p>
     <w:p>
@@ -6091,7 +6179,7 @@
         <w:spacing w:after="160" w:line="300"/>
       </w:pPr>
       <w:r>
-        <w:t xml:space="preserve">Если сложить реалистичное: сертификат B, лестница на чердак и посудомойка при WOZ в 230 тысяч дают 149 баллов и потолок около 974 евро; с сертификатом A — около 156 баллов и 1 022 евро, плюс возможная надбавка за памятник. Отдельная строка дохода, не связанная с баллами, — сдача с мебелью: плата за неё берётся сверх регулируемой аренды, ориентир комиссии — около 20 процентов стоимости обстановки в год; туда же относятся сервисные расходы по фактической стоимости.</w:t>
+        <w:t xml:space="preserve">Дополнительный доход вне балльной системы — сдача с мебелью: плата за неё взимается сверх регулируемой аренды, ориентир комиссии — около 20 % стоимости обстановки в год. Сервисные расходы (коммунальные услуги, интернет) перекладываются по фактической стоимости.</w:t>
       </w:r>
     </w:p>
     <w:p>
@@ -6105,8 +6193,8 @@
           <w:b/>
           <w:bCs/>
           <w:color w:val="1F2A38"/>
-          <w:sz w:val="28"/>
-          <w:szCs w:val="28"/>
+          <w:sz w:val="27"/>
+          <w:szCs w:val="27"/>
         </w:rPr>
         <w:t xml:space="preserve">Примечания</w:t>
       </w:r>
@@ -6116,7 +6204,7 @@
         <w:spacing w:after="160" w:line="300"/>
       </w:pPr>
       <w:r>
-        <w:t xml:space="preserve">Онлайн-проверка носит ориентировочный характер: при официальной процедуре пунктовку составляет инспектор комиссии. Суммы со знаком ≈ получены по линейной зависимости, выведенной из трёх официальных расчётов; точные значения даст таблица соответствующего года. Делители формулы WOZ, минимальная WOZ и таблица цен индексируются ежегодно, поэтому со временем цифры сдвинутся, но соотношения — балл около семи евро, три балла за двадцать тысяч WOZ — сохранятся. Статусы памятника и охраняемого ансамбля комиссия сама не проверяет: подтверждать их — задача арендодателя.</w:t>
+        <w:t xml:space="preserve">Huurprijscheck носит ориентировочный характер: при официальной процедуре пунктовку составляет инспектор комиссии. Суммы со знаком ≈ рассчитаны по линейной зависимости, выведенной из трёх официальных результатов; точные значения определяются таблицей соответствующего года. Делители формулы WOZ, минимальная WOZ и таблица цен индексируются ежегодно, поэтому абсолютные значения со временем сдвинутся при сохранении соотношений (балл — около € 7, три балла на € 20 000 WOZ). Статусы памятника и охраняемого ансамбля комиссия самостоятельно не проверяет — их подтверждение лежит на арендодателе.</w:t>
       </w:r>
     </w:p>
     <w:p>
@@ -6130,8 +6218,8 @@
           <w:b/>
           <w:bCs/>
           <w:color w:val="1F2A38"/>
-          <w:sz w:val="28"/>
-          <w:szCs w:val="28"/>
+          <w:sz w:val="27"/>
+          <w:szCs w:val="27"/>
         </w:rPr>
         <w:t xml:space="preserve">Источники</w:t>
       </w:r>
@@ -6141,7 +6229,7 @@
         <w:spacing w:after="160" w:line="300"/>
       </w:pPr>
       <w:r>
-        <w:t xml:space="preserve">Три отчёта Huurprijscheck от 27.08.2026 — исходные расчёты. Beleidsboek «Waarderingsstelsel zelfstandige woonruimte», Huurcommissie, действующая редакция от января 2026 года (huurcommissie.nl → Beleidsboeken) — таблица сертификатов, формула WOZ, вычет за лестницу, формула террасы, лимиты кухни и санузла, правила при отсутствии WOZ и сертификата, надбавки за памятники. Границы сегментов 2026 года — публикации !WOON (wooninfo.nl) и Woonbond (woonbond.nl).</w:t>
+        <w:t xml:space="preserve">Три отчёта Huurprijscheck от 27.08.2026 (исходные расчёты). Beleidsboek «Waarderingsstelsel zelfstandige woonruimte», Huurcommissie, редакция января 2026 года (huurcommissie.nl, раздел Beleidsboeken): таблица сертификатов, формула WOZ, вычет за лестницу, формула террасы, лимиты кухни и санузла, правила при отсутствии WOZ и сертификата, надбавки за памятники. Границы сегментов 2026 года: публикации !WOON (wooninfo.nl) и Woonbond (woonbond.nl).</w:t>
       </w:r>
     </w:p>
     <w:p>
@@ -6156,7 +6244,7 @@
           <w:sz w:val="19"/>
           <w:szCs w:val="19"/>
         </w:rPr>
-        <w:t xml:space="preserve">Подготовлено 27.08.2026. Обновление: текст переработан, цифры перепроверены построчно по политике Huurcommissie.</w:t>
+        <w:t xml:space="preserve">Подготовлено 27.08.2026.</w:t>
       </w:r>
     </w:p>
     <w:sectPr>
@@ -6333,8 +6421,26 @@
       </w:pPr>
     </w:lvl>
   </w:abstractNum>
+  <w:abstractNum w:abstractNumId="2" w15:restartNumberingAfterBreak="0">
+    <w:multiLevelType w:val="hybridMultilevel"/>
+    <w:lvl w:ilvl="0" w15:tentative="1">
+      <w:start w:val="1"/>
+      <w:numFmt w:val="decimal"/>
+      <w:lvlText w:val="%1."/>
+      <w:lvlJc w:val="left"/>
+      <w:pPr>
+        <w:ind w:left="420" w:hanging="280"/>
+      </w:pPr>
+    </w:lvl>
+  </w:abstractNum>
   <w:num w:numId="1">
     <w:abstractNumId w:val="1"/>
+    <w:lvlOverride w:ilvl="0">
+      <w:startOverride w:val="1"/>
+    </w:lvlOverride>
+  </w:num>
+  <w:num w:numId="2">
+    <w:abstractNumId w:val="2"/>
     <w:lvlOverride w:ilvl="0">
       <w:startOverride w:val="1"/>
     </w:lvlOverride>

</xml_diff>